<commit_message>
Built the solarsystem that recieves sun light and displays voltage reading
</commit_message>
<xml_diff>
--- a/3. Power Requirement.docx
+++ b/3. Power Requirement.docx
@@ -3077,15 +3077,7 @@
         <w:t>=</w:t>
       </w:r>
       <w:r>
-        <w:t xml:space="preserve"> 1.72 x 10^-</w:t>
-      </w:r>
-      <w:proofErr w:type="gramStart"/>
-      <w:r>
-        <w:t>2  x</w:t>
-      </w:r>
-      <w:proofErr w:type="gramEnd"/>
-      <w:r>
-        <w:t xml:space="preserve"> 18</w:t>
+        <w:t xml:space="preserve"> 1.72 x 10^-2 x 18</w:t>
       </w:r>
       <w:proofErr w:type="gramStart"/>
       <w:r>
@@ -4468,19 +4460,7 @@
               </w:rPr>
             </w:pPr>
             <w:r>
-              <w:t>Battery Capacity = IVh</w:t>
-            </w:r>
-            <w:r>
-              <w:t xml:space="preserve"> </w:t>
-            </w:r>
-            <w:r>
-              <w:t>/</w:t>
-            </w:r>
-            <w:r>
-              <w:t xml:space="preserve"> </w:t>
-            </w:r>
-            <w:r>
-              <w:t xml:space="preserve">V </w:t>
+              <w:t xml:space="preserve">Battery Capacity = IVh / V </w:t>
             </w:r>
             <w:r>
               <w:sym w:font="Wingdings" w:char="F0E8"/>
@@ -4651,19 +4631,7 @@
         <w:rPr>
           <w:u w:val="single"/>
         </w:rPr>
-        <w:t xml:space="preserve">To get the number of </w:t>
-      </w:r>
-      <w:r>
-        <w:rPr>
-          <w:u w:val="single"/>
-        </w:rPr>
-        <w:t>series</w:t>
-      </w:r>
-      <w:r>
-        <w:rPr>
-          <w:u w:val="single"/>
-        </w:rPr>
-        <w:t xml:space="preserve"> cells</w:t>
+        <w:t>To get the number of series cells</w:t>
       </w:r>
     </w:p>
     <w:p>
@@ -4676,58 +4644,25 @@
       </w:r>
       <w:proofErr w:type="gramEnd"/>
       <w:r>
-        <w:t xml:space="preserve"> of </w:t>
-      </w:r>
-      <w:r>
-        <w:t xml:space="preserve">series </w:t>
-      </w:r>
-      <w:r>
-        <w:t xml:space="preserve">in the configuration, I will divide the </w:t>
-      </w:r>
-      <w:r>
-        <w:t>p</w:t>
+        <w:t xml:space="preserve"> of series in the configuration, I will divide the p</w:t>
       </w:r>
       <w:r>
         <w:t>ack</w:t>
       </w:r>
       <w:r>
-        <w:t xml:space="preserve"> voltage</w:t>
-      </w:r>
-      <w:r>
-        <w:t xml:space="preserve"> by the single cell </w:t>
-      </w:r>
-      <w:r>
-        <w:t>voltage</w:t>
-      </w:r>
-      <w:r>
-        <w:t xml:space="preserve">, that gives </w:t>
-      </w:r>
-      <w:r>
-        <w:t>1</w:t>
+        <w:t xml:space="preserve"> voltage by the single cell voltage, that gives 1</w:t>
       </w:r>
       <w:r>
         <w:t>1.1</w:t>
       </w:r>
       <w:r>
-        <w:t>/</w:t>
-      </w:r>
-      <w:r>
-        <w:t>3.7</w:t>
-      </w:r>
-      <w:r>
-        <w:t xml:space="preserve"> = </w:t>
-      </w:r>
-      <w:r>
-        <w:t>3</w:t>
+        <w:t>/3.7 = 3</w:t>
       </w:r>
       <w:r>
         <w:t xml:space="preserve"> </w:t>
       </w:r>
       <w:r>
-        <w:t xml:space="preserve">cells in </w:t>
-      </w:r>
-      <w:r>
-        <w:t>series.</w:t>
+        <w:t>cells in series.</w:t>
       </w:r>
     </w:p>
     <w:p>
@@ -5289,7 +5224,19 @@
     </w:p>
     <w:p>
       <w:r>
-        <w:t>First, we convert your energy (88.8Wh) into Amp-hours (Ah) to see how much "room" is in the tank.</w:t>
+        <w:t xml:space="preserve">First, we convert </w:t>
+      </w:r>
+      <w:r>
+        <w:t>the</w:t>
+      </w:r>
+      <w:r>
+        <w:t xml:space="preserve"> energy (</w:t>
+      </w:r>
+      <w:r>
+        <w:t>660</w:t>
+      </w:r>
+      <w:r>
+        <w:t>Wh) into Amp-hours (Ah) to see how much "room" is in the tank.</w:t>
       </w:r>
     </w:p>
     <w:p>
@@ -5310,7 +5257,7 @@
         <w:t xml:space="preserve"> </w:t>
       </w:r>
       <w:r>
-        <w:t>485.3</w:t>
+        <w:t>660</w:t>
       </w:r>
       <w:r>
         <w:t>Wh</w:t>
@@ -5328,7 +5275,21 @@
           <w:b/>
           <w:bCs/>
         </w:rPr>
-        <w:t>Nominal Voltage (4S):</w:t>
+        <w:t>Nominal Voltage (</w:t>
+      </w:r>
+      <w:r>
+        <w:rPr>
+          <w:b/>
+          <w:bCs/>
+        </w:rPr>
+        <w:t>3</w:t>
+      </w:r>
+      <w:r>
+        <w:rPr>
+          <w:b/>
+          <w:bCs/>
+        </w:rPr>
+        <w:t>S):</w:t>
       </w:r>
       <w:r>
         <w:t xml:space="preserve"> 1</w:t>
@@ -5810,7 +5771,7 @@
           <w:bCs/>
           <w:u w:val="single"/>
         </w:rPr>
-        <w:t>How to calibrate your XL4016 for your 4S pack:</w:t>
+        <w:t>How to calibrate XL4016 for your 4S pack:</w:t>
       </w:r>
     </w:p>
     <w:p>
@@ -6379,425 +6340,6 @@
         <w:spacing w:after="0"/>
       </w:pPr>
     </w:p>
-    <w:p/>
-    <w:p>
-      <w:r>
-        <w:rPr>
-          <w:b/>
-          <w:bCs/>
-        </w:rPr>
-        <w:t>7</w:t>
-      </w:r>
-      <w:r>
-        <w:rPr>
-          <w:b/>
-          <w:bCs/>
-        </w:rPr>
-        <w:t xml:space="preserve">. </w:t>
-      </w:r>
-      <w:r>
-        <w:rPr>
-          <w:b/>
-          <w:bCs/>
-          <w:u w:val="single"/>
-        </w:rPr>
-        <w:t xml:space="preserve">BMS Sizing </w:t>
-      </w:r>
-    </w:p>
-    <w:p>
-      <w:pPr>
-        <w:spacing w:after="0"/>
-      </w:pPr>
-      <w:r>
-        <w:t xml:space="preserve">To determine the ideal BMS for your </w:t>
-      </w:r>
-      <w:r>
-        <w:rPr>
-          <w:b/>
-          <w:bCs/>
-        </w:rPr>
-        <w:t>3</w:t>
-      </w:r>
-      <w:r>
-        <w:rPr>
-          <w:b/>
-          <w:bCs/>
-        </w:rPr>
-        <w:t>S</w:t>
-      </w:r>
-      <w:r>
-        <w:rPr>
-          <w:b/>
-          <w:bCs/>
-        </w:rPr>
-        <w:t>2</w:t>
-      </w:r>
-      <w:r>
-        <w:rPr>
-          <w:b/>
-          <w:bCs/>
-        </w:rPr>
-        <w:t>7</w:t>
-      </w:r>
-      <w:r>
-        <w:rPr>
-          <w:b/>
-          <w:bCs/>
-        </w:rPr>
-        <w:t>P</w:t>
-      </w:r>
-      <w:r>
-        <w:t xml:space="preserve"> pack, we first need to translate your "Wh" load into "Amps," as BMS units are rated by current (A</w:t>
-      </w:r>
-      <w:r>
-        <w:t>mps</w:t>
-      </w:r>
-      <w:r>
-        <w:t>), not energy (Wh).</w:t>
-      </w:r>
-    </w:p>
-    <w:p>
-      <w:pPr>
-        <w:spacing w:after="0"/>
-        <w:rPr>
-          <w:b/>
-          <w:bCs/>
-        </w:rPr>
-      </w:pPr>
-      <w:r>
-        <w:rPr>
-          <w:b/>
-          <w:bCs/>
-        </w:rPr>
-        <w:t>1. Calculating Your Current Draw</w:t>
-      </w:r>
-    </w:p>
-    <w:p>
-      <w:pPr>
-        <w:spacing w:after="0"/>
-      </w:pPr>
-      <w:r>
-        <w:t xml:space="preserve">Since you are using a </w:t>
-      </w:r>
-      <w:r>
-        <w:rPr>
-          <w:b/>
-          <w:bCs/>
-        </w:rPr>
-        <w:t>3</w:t>
-      </w:r>
-      <w:r>
-        <w:rPr>
-          <w:b/>
-          <w:bCs/>
-        </w:rPr>
-        <w:t>S</w:t>
-      </w:r>
-      <w:r>
-        <w:t xml:space="preserve"> (</w:t>
-      </w:r>
-      <w:r>
-        <w:t>3</w:t>
-      </w:r>
-      <w:r>
-        <w:t xml:space="preserve"> cells in series) Li-ion pack, your nominal voltage is </w:t>
-      </w:r>
-      <w:r>
-        <w:rPr>
-          <w:b/>
-          <w:bCs/>
-        </w:rPr>
-        <w:t>11</w:t>
-      </w:r>
-      <w:r>
-        <w:rPr>
-          <w:b/>
-          <w:bCs/>
-        </w:rPr>
-        <w:t>.</w:t>
-      </w:r>
-      <w:r>
-        <w:rPr>
-          <w:b/>
-          <w:bCs/>
-        </w:rPr>
-        <w:t>1</w:t>
-      </w:r>
-      <w:r>
-        <w:rPr>
-          <w:b/>
-          <w:bCs/>
-        </w:rPr>
-        <w:t>V</w:t>
-      </w:r>
-      <w:r>
-        <w:t xml:space="preserve"> (3.7V per cell).</w:t>
-      </w:r>
-    </w:p>
-    <w:p>
-      <w:pPr>
-        <w:numPr>
-          <w:ilvl w:val="0"/>
-          <w:numId w:val="1"/>
-        </w:numPr>
-        <w:spacing w:after="0"/>
-      </w:pPr>
-      <w:r>
-        <w:rPr>
-          <w:b/>
-          <w:bCs/>
-        </w:rPr>
-        <w:t>Load Power:</w:t>
-      </w:r>
-      <w:r>
-        <w:t xml:space="preserve"> </w:t>
-      </w:r>
-      <w:r>
-        <w:t>69.8</w:t>
-      </w:r>
-      <w:r>
-        <w:t xml:space="preserve"> W</w:t>
-      </w:r>
-    </w:p>
-    <w:p>
-      <w:pPr>
-        <w:numPr>
-          <w:ilvl w:val="0"/>
-          <w:numId w:val="1"/>
-        </w:numPr>
-        <w:spacing w:after="0"/>
-      </w:pPr>
-      <w:r>
-        <w:rPr>
-          <w:b/>
-          <w:bCs/>
-        </w:rPr>
-        <w:t>Formula:</w:t>
-      </w:r>
-      <w:r>
-        <w:t xml:space="preserve"> Amps (A) = Watts (W) / Volts (V)</w:t>
-      </w:r>
-    </w:p>
-    <w:p>
-      <w:pPr>
-        <w:numPr>
-          <w:ilvl w:val="0"/>
-          <w:numId w:val="1"/>
-        </w:numPr>
-        <w:spacing w:after="0"/>
-      </w:pPr>
-      <w:r>
-        <w:rPr>
-          <w:b/>
-          <w:bCs/>
-        </w:rPr>
-        <w:t>Calculation:</w:t>
-      </w:r>
-      <w:r>
-        <w:t xml:space="preserve"> </w:t>
-      </w:r>
-      <w:r>
-        <w:t>69.8</w:t>
-      </w:r>
-      <w:r>
-        <w:t xml:space="preserve">W / </w:t>
-      </w:r>
-      <w:r>
-        <w:t>1</w:t>
-      </w:r>
-      <w:r>
-        <w:t>2</w:t>
-      </w:r>
-      <w:r>
-        <w:t xml:space="preserve">V </w:t>
-      </w:r>
-      <w:r>
-        <w:t>approx.</w:t>
-      </w:r>
-      <w:r>
-        <w:t xml:space="preserve"> </w:t>
-      </w:r>
-      <w:r>
-        <w:t>5.8</w:t>
-      </w:r>
-      <w:r>
-        <w:t>A</w:t>
-      </w:r>
-    </w:p>
-    <w:p>
-      <w:pPr>
-        <w:spacing w:after="0"/>
-      </w:pPr>
-      <w:r>
-        <w:t>Your device will pull approximately</w:t>
-      </w:r>
-      <w:r>
-        <w:t xml:space="preserve"> 5.8</w:t>
-      </w:r>
-      <w:r>
-        <w:rPr>
-          <w:b/>
-          <w:bCs/>
-        </w:rPr>
-        <w:t xml:space="preserve"> Amps</w:t>
-      </w:r>
-      <w:r>
-        <w:t xml:space="preserve"> continuously.</w:t>
-      </w:r>
-    </w:p>
-    <w:p>
-      <w:pPr>
-        <w:spacing w:after="0"/>
-        <w:rPr>
-          <w:b/>
-          <w:bCs/>
-        </w:rPr>
-      </w:pPr>
-      <w:r>
-        <w:rPr>
-          <w:b/>
-          <w:bCs/>
-        </w:rPr>
-        <w:lastRenderedPageBreak/>
-        <w:t>2. The Ideal BMS Rating</w:t>
-      </w:r>
-    </w:p>
-    <w:p>
-      <w:pPr>
-        <w:spacing w:after="0"/>
-      </w:pPr>
-      <w:r>
-        <w:t xml:space="preserve">To ensure the BMS doesn't overheat or "trip" during a minor surge, you should apply a </w:t>
-      </w:r>
-      <w:r>
-        <w:rPr>
-          <w:b/>
-          <w:bCs/>
-        </w:rPr>
-        <w:t>4</w:t>
-      </w:r>
-      <w:r>
-        <w:rPr>
-          <w:b/>
-          <w:bCs/>
-        </w:rPr>
-        <w:t>0% safety buffer</w:t>
-      </w:r>
-      <w:r>
-        <w:t>.</w:t>
-      </w:r>
-    </w:p>
-    <w:p>
-      <w:pPr>
-        <w:spacing w:after="0"/>
-      </w:pPr>
-      <w:r>
-        <w:t>i.e. 5.8 + (0.4 x 5.8) = 8.12</w:t>
-      </w:r>
-    </w:p>
-    <w:p>
-      <w:pPr>
-        <w:numPr>
-          <w:ilvl w:val="0"/>
-          <w:numId w:val="2"/>
-        </w:numPr>
-        <w:spacing w:after="0"/>
-      </w:pPr>
-      <w:r>
-        <w:rPr>
-          <w:b/>
-          <w:bCs/>
-        </w:rPr>
-        <w:t>Minimum Rating:</w:t>
-      </w:r>
-      <w:r>
-        <w:t xml:space="preserve"> 12A (too close for comfort)</w:t>
-      </w:r>
-    </w:p>
-    <w:p>
-      <w:pPr>
-        <w:numPr>
-          <w:ilvl w:val="0"/>
-          <w:numId w:val="2"/>
-        </w:numPr>
-        <w:spacing w:after="0"/>
-      </w:pPr>
-      <w:r>
-        <w:rPr>
-          <w:b/>
-          <w:bCs/>
-        </w:rPr>
-        <w:t>Ideal Rating:</w:t>
-      </w:r>
-      <w:r>
-        <w:t xml:space="preserve"> </w:t>
-      </w:r>
-      <w:r>
-        <w:rPr>
-          <w:b/>
-          <w:bCs/>
-        </w:rPr>
-        <w:t>15A to 20A</w:t>
-      </w:r>
-    </w:p>
-    <w:p>
-      <w:pPr>
-        <w:spacing w:after="0"/>
-      </w:pPr>
-      <w:r>
-        <w:t xml:space="preserve">A </w:t>
-      </w:r>
-      <w:r>
-        <w:rPr>
-          <w:b/>
-          <w:bCs/>
-        </w:rPr>
-        <w:t>15A or 20A S BMS</w:t>
-      </w:r>
-      <w:r>
-        <w:t xml:space="preserve"> is the "sweet spot" for your setup. It is large enough to handle your 6</w:t>
-      </w:r>
-      <w:r>
-        <w:t>9.8</w:t>
-      </w:r>
-      <w:r>
-        <w:t>W load with ease but small enough to remain cost-effective and compact.</w:t>
-      </w:r>
-    </w:p>
-    <w:p>
-      <w:pPr>
-        <w:spacing w:after="0"/>
-      </w:pPr>
-    </w:p>
-    <w:p>
-      <w:pPr>
-        <w:spacing w:after="0"/>
-      </w:pPr>
-    </w:p>
-    <w:p>
-      <w:pPr>
-        <w:rPr>
-          <w:b/>
-          <w:bCs/>
-          <w:highlight w:val="cyan"/>
-          <w:u w:val="single"/>
-        </w:rPr>
-      </w:pPr>
-    </w:p>
-    <w:p>
-      <w:pPr>
-        <w:rPr>
-          <w:highlight w:val="cyan"/>
-        </w:rPr>
-      </w:pPr>
-    </w:p>
-    <w:p>
-      <w:pPr>
-        <w:rPr>
-          <w:highlight w:val="cyan"/>
-        </w:rPr>
-      </w:pPr>
-    </w:p>
     <w:p>
       <w:pPr>
         <w:rPr>
@@ -6926,6 +6468,7 @@
         </w:numPr>
       </w:pPr>
       <w:r>
+        <w:lastRenderedPageBreak/>
         <w:t>Connect your 19V DC wall adapter to the IN+ / IN- terminals for calibration.</w:t>
       </w:r>
     </w:p>
@@ -7075,7 +6618,6 @@
           <w:b/>
           <w:bCs/>
         </w:rPr>
-        <w:lastRenderedPageBreak/>
         <w:t>Set Current (CC):</w:t>
       </w:r>
     </w:p>
@@ -7311,7 +6853,7 @@
           <w:noProof/>
         </w:rPr>
         <w:drawing>
-          <wp:inline distT="0" distB="0" distL="0" distR="0" wp14:anchorId="378CB4D0" wp14:editId="3CB5A071">
+          <wp:inline distT="0" distB="0" distL="0" distR="0" wp14:anchorId="60EEE93F" wp14:editId="48770F58">
             <wp:extent cx="8890" cy="8890"/>
             <wp:effectExtent l="0" t="0" r="0" b="0"/>
             <wp:docPr id="1997143979" name="Picture 17"/>
@@ -7362,6 +6904,7 @@
     </w:p>
     <w:p>
       <w:r>
+        <w:lastRenderedPageBreak/>
         <w:t> </w:t>
       </w:r>
       <w:r>
@@ -7399,7 +6942,7 @@
           <w:noProof/>
         </w:rPr>
         <w:drawing>
-          <wp:inline distT="0" distB="0" distL="0" distR="0" wp14:anchorId="2C016642" wp14:editId="5E184479">
+          <wp:inline distT="0" distB="0" distL="0" distR="0" wp14:anchorId="1A948DAB" wp14:editId="500BA5C6">
             <wp:extent cx="8890" cy="8890"/>
             <wp:effectExtent l="0" t="0" r="0" b="0"/>
             <wp:docPr id="1156895318" name="Picture 16"/>
@@ -7487,7 +7030,7 @@
           <w:noProof/>
         </w:rPr>
         <w:drawing>
-          <wp:inline distT="0" distB="0" distL="0" distR="0" wp14:anchorId="4CBCAB85" wp14:editId="312442C7">
+          <wp:inline distT="0" distB="0" distL="0" distR="0" wp14:anchorId="69E36FCC" wp14:editId="5544E144">
             <wp:extent cx="8890" cy="8890"/>
             <wp:effectExtent l="0" t="0" r="0" b="0"/>
             <wp:docPr id="2125802689" name="Picture 15"/>
@@ -7575,7 +7118,7 @@
           <w:noProof/>
         </w:rPr>
         <w:drawing>
-          <wp:inline distT="0" distB="0" distL="0" distR="0" wp14:anchorId="7D0CFA55" wp14:editId="04144229">
+          <wp:inline distT="0" distB="0" distL="0" distR="0" wp14:anchorId="4E82C6B8" wp14:editId="0A0E5298">
             <wp:extent cx="8890" cy="8890"/>
             <wp:effectExtent l="0" t="0" r="0" b="0"/>
             <wp:docPr id="731513367" name="Picture 14"/>
@@ -7645,116 +7188,536 @@
           <w:b/>
           <w:bCs/>
         </w:rPr>
+        <w:t>The Logic:</w:t>
+      </w:r>
+      <w:r>
+        <w:t> When the sun is high, the XL4016 provides the </w:t>
+      </w:r>
+      <w:r>
+        <w:rPr>
+          <w:b/>
+          <w:bCs/>
+        </w:rPr>
+        <w:t>4A</w:t>
+      </w:r>
+      <w:r>
+        <w:t> you set. If your motors pull </w:t>
+      </w:r>
+      <w:r>
+        <w:rPr>
+          <w:b/>
+          <w:bCs/>
+        </w:rPr>
+        <w:t>3A</w:t>
+      </w:r>
+      <w:r>
+        <w:t>, they take it directly from the XL4016, and the remaining </w:t>
+      </w:r>
+      <w:r>
+        <w:rPr>
+          <w:b/>
+          <w:bCs/>
+        </w:rPr>
+        <w:t>1A</w:t>
+      </w:r>
+      <w:r>
+        <w:t> goes into the battery. If the motors pull </w:t>
+      </w:r>
+      <w:r>
+        <w:rPr>
+          <w:b/>
+          <w:bCs/>
+        </w:rPr>
+        <w:t>6A</w:t>
+      </w:r>
+      <w:r>
+        <w:t>, they take all </w:t>
+      </w:r>
+      <w:r>
+        <w:rPr>
+          <w:b/>
+          <w:bCs/>
+        </w:rPr>
+        <w:t>4A</w:t>
+      </w:r>
+      <w:r>
+        <w:t> from the sun and "borrow" the remaining </w:t>
+      </w:r>
+      <w:r>
+        <w:rPr>
+          <w:b/>
+          <w:bCs/>
+        </w:rPr>
+        <w:t>2A</w:t>
+      </w:r>
+      <w:r>
+        <w:t> from the battery.</w:t>
+      </w:r>
+    </w:p>
+    <w:p>
+      <w:pPr>
+        <w:rPr>
+          <w:highlight w:val="cyan"/>
+        </w:rPr>
+      </w:pPr>
+    </w:p>
+    <w:p>
+      <w:r>
+        <w:rPr>
+          <w:b/>
+          <w:bCs/>
+        </w:rPr>
+        <w:t>Diode to pick for blocking current from flowing:</w:t>
+      </w:r>
+      <w:r>
+        <w:rPr>
+          <w:b/>
+          <w:bCs/>
+        </w:rPr>
+        <w:br/>
+      </w:r>
+      <w:r>
+        <w:rPr>
+          <w:b/>
+          <w:bCs/>
+        </w:rPr>
+        <w:t>10A Schottky diode</w:t>
+      </w:r>
+      <w:r>
+        <w:rPr>
+          <w:b/>
+          <w:bCs/>
+        </w:rPr>
+        <w:t xml:space="preserve"> </w:t>
+      </w:r>
+      <w:r>
+        <w:rPr>
+          <w:b/>
+          <w:bCs/>
+        </w:rPr>
+        <w:t>10SQ045 or 10SQ050</w:t>
+      </w:r>
+    </w:p>
+    <w:p>
+      <w:pPr>
+        <w:spacing w:after="0"/>
+      </w:pPr>
+    </w:p>
+    <w:p/>
+    <w:p>
+      <w:r>
+        <w:rPr>
+          <w:b/>
+          <w:bCs/>
+        </w:rPr>
+        <w:t>7</w:t>
+      </w:r>
+      <w:r>
+        <w:rPr>
+          <w:b/>
+          <w:bCs/>
+        </w:rPr>
+        <w:t xml:space="preserve">. </w:t>
+      </w:r>
+      <w:r>
+        <w:rPr>
+          <w:b/>
+          <w:bCs/>
+          <w:u w:val="single"/>
+        </w:rPr>
+        <w:t xml:space="preserve">BMS Sizing </w:t>
+      </w:r>
+    </w:p>
+    <w:p>
+      <w:pPr>
+        <w:spacing w:after="0"/>
+      </w:pPr>
+      <w:r>
+        <w:t xml:space="preserve">To determine the ideal BMS for your </w:t>
+      </w:r>
+      <w:r>
+        <w:rPr>
+          <w:b/>
+          <w:bCs/>
+        </w:rPr>
+        <w:t>3</w:t>
+      </w:r>
+      <w:r>
+        <w:rPr>
+          <w:b/>
+          <w:bCs/>
+        </w:rPr>
+        <w:t>S</w:t>
+      </w:r>
+      <w:r>
+        <w:rPr>
+          <w:b/>
+          <w:bCs/>
+        </w:rPr>
+        <w:t>2</w:t>
+      </w:r>
+      <w:r>
+        <w:rPr>
+          <w:b/>
+          <w:bCs/>
+        </w:rPr>
+        <w:t>7</w:t>
+      </w:r>
+      <w:r>
+        <w:rPr>
+          <w:b/>
+          <w:bCs/>
+        </w:rPr>
+        <w:t>P</w:t>
+      </w:r>
+      <w:r>
+        <w:t xml:space="preserve"> pack, we first need to translate your "Wh" load into "Amps," as BMS units are rated by current (A</w:t>
+      </w:r>
+      <w:r>
+        <w:t>mps</w:t>
+      </w:r>
+      <w:r>
+        <w:t>), not energy (Wh).</w:t>
+      </w:r>
+    </w:p>
+    <w:p>
+      <w:pPr>
+        <w:spacing w:after="0"/>
+        <w:rPr>
+          <w:b/>
+          <w:bCs/>
+        </w:rPr>
+      </w:pPr>
+      <w:r>
+        <w:rPr>
+          <w:b/>
+          <w:bCs/>
+        </w:rPr>
+        <w:t>1. Calculating Your Current Draw</w:t>
+      </w:r>
+    </w:p>
+    <w:p>
+      <w:pPr>
+        <w:spacing w:after="0"/>
+      </w:pPr>
+      <w:r>
+        <w:t xml:space="preserve">Since you are using a </w:t>
+      </w:r>
+      <w:r>
+        <w:rPr>
+          <w:b/>
+          <w:bCs/>
+        </w:rPr>
+        <w:t>3</w:t>
+      </w:r>
+      <w:r>
+        <w:rPr>
+          <w:b/>
+          <w:bCs/>
+        </w:rPr>
+        <w:t>S</w:t>
+      </w:r>
+      <w:r>
+        <w:t xml:space="preserve"> (</w:t>
+      </w:r>
+      <w:r>
+        <w:t>3</w:t>
+      </w:r>
+      <w:r>
+        <w:t xml:space="preserve"> cells in series) Li-ion pack, your nominal voltage is </w:t>
+      </w:r>
+      <w:r>
+        <w:rPr>
+          <w:b/>
+          <w:bCs/>
+        </w:rPr>
+        <w:t>11</w:t>
+      </w:r>
+      <w:r>
+        <w:rPr>
+          <w:b/>
+          <w:bCs/>
+        </w:rPr>
+        <w:t>.</w:t>
+      </w:r>
+      <w:r>
+        <w:rPr>
+          <w:b/>
+          <w:bCs/>
+        </w:rPr>
+        <w:t>1</w:t>
+      </w:r>
+      <w:r>
+        <w:rPr>
+          <w:b/>
+          <w:bCs/>
+        </w:rPr>
+        <w:t>V</w:t>
+      </w:r>
+      <w:r>
+        <w:t xml:space="preserve"> (3.7V per cell).</w:t>
+      </w:r>
+    </w:p>
+    <w:p>
+      <w:pPr>
+        <w:numPr>
+          <w:ilvl w:val="0"/>
+          <w:numId w:val="1"/>
+        </w:numPr>
+        <w:spacing w:after="0"/>
+      </w:pPr>
+      <w:r>
+        <w:rPr>
+          <w:b/>
+          <w:bCs/>
+        </w:rPr>
+        <w:t>Load Power:</w:t>
+      </w:r>
+      <w:r>
+        <w:t xml:space="preserve"> 69.8</w:t>
+      </w:r>
+      <w:r>
+        <w:t xml:space="preserve"> W</w:t>
+      </w:r>
+    </w:p>
+    <w:p>
+      <w:pPr>
+        <w:numPr>
+          <w:ilvl w:val="0"/>
+          <w:numId w:val="1"/>
+        </w:numPr>
+        <w:spacing w:after="0"/>
+      </w:pPr>
+      <w:r>
+        <w:rPr>
+          <w:b/>
+          <w:bCs/>
+        </w:rPr>
+        <w:t>Formula:</w:t>
+      </w:r>
+      <w:r>
+        <w:t xml:space="preserve"> Amps (A) = Watts (W) / Volts (V)</w:t>
+      </w:r>
+    </w:p>
+    <w:p>
+      <w:pPr>
+        <w:numPr>
+          <w:ilvl w:val="0"/>
+          <w:numId w:val="1"/>
+        </w:numPr>
+        <w:spacing w:after="0"/>
+      </w:pPr>
+      <w:r>
+        <w:rPr>
+          <w:b/>
+          <w:bCs/>
+        </w:rPr>
+        <w:t>Calculation:</w:t>
+      </w:r>
+      <w:r>
+        <w:t xml:space="preserve"> </w:t>
+      </w:r>
+      <w:r>
+        <w:t>69.8</w:t>
+      </w:r>
+      <w:r>
+        <w:t xml:space="preserve">W / </w:t>
+      </w:r>
+      <w:r>
+        <w:t>1</w:t>
+      </w:r>
+      <w:r>
+        <w:t>2</w:t>
+      </w:r>
+      <w:r>
+        <w:t xml:space="preserve">V </w:t>
+      </w:r>
+      <w:r>
+        <w:t>approx.</w:t>
+      </w:r>
+      <w:r>
+        <w:t xml:space="preserve"> </w:t>
+      </w:r>
+      <w:r>
+        <w:t>5.8</w:t>
+      </w:r>
+      <w:r>
+        <w:t>A</w:t>
+      </w:r>
+    </w:p>
+    <w:p>
+      <w:pPr>
+        <w:spacing w:after="0"/>
+      </w:pPr>
+      <w:r>
+        <w:t>Your device will pull approximately</w:t>
+      </w:r>
+      <w:r>
+        <w:t xml:space="preserve"> 5.8</w:t>
+      </w:r>
+      <w:r>
+        <w:rPr>
+          <w:b/>
+          <w:bCs/>
+        </w:rPr>
+        <w:t xml:space="preserve"> Amps</w:t>
+      </w:r>
+      <w:r>
+        <w:t xml:space="preserve"> continuously.</w:t>
+      </w:r>
+    </w:p>
+    <w:p>
+      <w:pPr>
+        <w:spacing w:after="0"/>
+        <w:rPr>
+          <w:b/>
+          <w:bCs/>
+        </w:rPr>
+      </w:pPr>
+      <w:r>
+        <w:rPr>
+          <w:b/>
+          <w:bCs/>
+        </w:rPr>
+        <w:t>2. The Ideal BMS Rating</w:t>
+      </w:r>
+    </w:p>
+    <w:p>
+      <w:pPr>
+        <w:spacing w:after="0"/>
+      </w:pPr>
+      <w:r>
+        <w:t xml:space="preserve">To ensure the BMS doesn't overheat or "trip" during a minor surge, you should apply a </w:t>
+      </w:r>
+      <w:r>
+        <w:rPr>
+          <w:b/>
+          <w:bCs/>
+        </w:rPr>
+        <w:t>4</w:t>
+      </w:r>
+      <w:r>
+        <w:rPr>
+          <w:b/>
+          <w:bCs/>
+        </w:rPr>
+        <w:t>0% safety buffer</w:t>
+      </w:r>
+      <w:r>
+        <w:t>.</w:t>
+      </w:r>
+    </w:p>
+    <w:p>
+      <w:pPr>
+        <w:spacing w:after="0"/>
+      </w:pPr>
+      <w:r>
+        <w:t>i.e. 5.8 + (0.4 x 5.8) = 8.12</w:t>
+      </w:r>
+    </w:p>
+    <w:p>
+      <w:pPr>
+        <w:numPr>
+          <w:ilvl w:val="0"/>
+          <w:numId w:val="2"/>
+        </w:numPr>
+        <w:spacing w:after="0"/>
+      </w:pPr>
+      <w:r>
+        <w:rPr>
+          <w:b/>
+          <w:bCs/>
+        </w:rPr>
+        <w:t>Minimum Rating:</w:t>
+      </w:r>
+      <w:r>
+        <w:t xml:space="preserve"> 12A (too close for comfort)</w:t>
+      </w:r>
+    </w:p>
+    <w:p>
+      <w:pPr>
+        <w:numPr>
+          <w:ilvl w:val="0"/>
+          <w:numId w:val="2"/>
+        </w:numPr>
+        <w:spacing w:after="0"/>
+      </w:pPr>
+      <w:r>
+        <w:rPr>
+          <w:b/>
+          <w:bCs/>
+        </w:rPr>
         <w:lastRenderedPageBreak/>
-        <w:t>The Logic:</w:t>
-      </w:r>
-      <w:r>
-        <w:t> When the sun is high, the XL4016 provides the </w:t>
-      </w:r>
-      <w:r>
-        <w:rPr>
-          <w:b/>
-          <w:bCs/>
-        </w:rPr>
-        <w:t>4A</w:t>
-      </w:r>
-      <w:r>
-        <w:t> you set. If your motors pull </w:t>
-      </w:r>
-      <w:r>
-        <w:rPr>
-          <w:b/>
-          <w:bCs/>
-        </w:rPr>
-        <w:t>3A</w:t>
-      </w:r>
-      <w:r>
-        <w:t>, they take it directly from the XL4016, and the remaining </w:t>
-      </w:r>
-      <w:r>
-        <w:rPr>
-          <w:b/>
-          <w:bCs/>
-        </w:rPr>
-        <w:t>1A</w:t>
-      </w:r>
-      <w:r>
-        <w:t> goes into the battery. If the motors pull </w:t>
-      </w:r>
-      <w:r>
-        <w:rPr>
-          <w:b/>
-          <w:bCs/>
-        </w:rPr>
-        <w:t>6A</w:t>
-      </w:r>
-      <w:r>
-        <w:t>, they take all </w:t>
-      </w:r>
-      <w:r>
-        <w:rPr>
-          <w:b/>
-          <w:bCs/>
-        </w:rPr>
-        <w:t>4A</w:t>
-      </w:r>
-      <w:r>
-        <w:t> from the sun and "borrow" the remaining </w:t>
-      </w:r>
-      <w:r>
-        <w:rPr>
-          <w:b/>
-          <w:bCs/>
-        </w:rPr>
-        <w:t>2A</w:t>
-      </w:r>
-      <w:r>
-        <w:t> from the battery.</w:t>
-      </w:r>
-    </w:p>
-    <w:p>
-      <w:pPr>
-        <w:rPr>
+        <w:t>Ideal Rating:</w:t>
+      </w:r>
+      <w:r>
+        <w:t xml:space="preserve"> </w:t>
+      </w:r>
+      <w:r>
+        <w:rPr>
+          <w:b/>
+          <w:bCs/>
+        </w:rPr>
+        <w:t>15A to 20A</w:t>
+      </w:r>
+    </w:p>
+    <w:p>
+      <w:pPr>
+        <w:spacing w:after="0"/>
+      </w:pPr>
+      <w:r>
+        <w:t xml:space="preserve">A </w:t>
+      </w:r>
+      <w:r>
+        <w:rPr>
+          <w:b/>
+          <w:bCs/>
+        </w:rPr>
+        <w:t>15A or 20A S BMS</w:t>
+      </w:r>
+      <w:r>
+        <w:t xml:space="preserve"> is the "sweet spot" for your setup. It is large enough to handle your 6</w:t>
+      </w:r>
+      <w:r>
+        <w:t>9.8</w:t>
+      </w:r>
+      <w:r>
+        <w:t>W load with ease but small enough to remain cost-effective and compact.</w:t>
+      </w:r>
+    </w:p>
+    <w:p>
+      <w:pPr>
+        <w:spacing w:after="0"/>
+      </w:pPr>
+    </w:p>
+    <w:p>
+      <w:pPr>
+        <w:spacing w:after="0"/>
+      </w:pPr>
+    </w:p>
+    <w:p>
+      <w:pPr>
+        <w:rPr>
+          <w:b/>
+          <w:bCs/>
           <w:highlight w:val="cyan"/>
-        </w:rPr>
-      </w:pPr>
-    </w:p>
-    <w:p>
-      <w:r>
-        <w:rPr>
-          <w:b/>
-          <w:bCs/>
-        </w:rPr>
-        <w:t>Diode to pick for blocking current from flowing:</w:t>
-      </w:r>
-      <w:r>
-        <w:rPr>
-          <w:b/>
-          <w:bCs/>
-        </w:rPr>
-        <w:br/>
-      </w:r>
-      <w:r>
-        <w:rPr>
-          <w:b/>
-          <w:bCs/>
-        </w:rPr>
-        <w:t>10A Schottky diode</w:t>
-      </w:r>
-      <w:r>
-        <w:rPr>
-          <w:b/>
-          <w:bCs/>
-        </w:rPr>
-        <w:t xml:space="preserve"> </w:t>
-      </w:r>
-      <w:r>
-        <w:rPr>
-          <w:b/>
-          <w:bCs/>
-        </w:rPr>
-        <w:t>10SQ045 or 10SQ050</w:t>
-      </w:r>
+          <w:u w:val="single"/>
+        </w:rPr>
+      </w:pPr>
+    </w:p>
+    <w:p>
+      <w:pPr>
+        <w:rPr>
+          <w:highlight w:val="cyan"/>
+        </w:rPr>
+      </w:pPr>
+    </w:p>
+    <w:p>
+      <w:pPr>
+        <w:rPr>
+          <w:highlight w:val="cyan"/>
+        </w:rPr>
+      </w:pPr>
     </w:p>
     <w:p>
       <w:pPr>
@@ -8110,6 +8073,7 @@
           <w:bCs/>
           <w:highlight w:val="cyan"/>
         </w:rPr>
+        <w:lastRenderedPageBreak/>
         <w:t>Low Voltage Disconnect (LVD):</w:t>
       </w:r>
       <w:r>
@@ -11868,6 +11832,7 @@
   <w:style w:type="character" w:default="1" w:styleId="DefaultParagraphFont">
     <w:name w:val="Default Paragraph Font"/>
     <w:uiPriority w:val="1"/>
+    <w:semiHidden/>
     <w:unhideWhenUsed/>
   </w:style>
   <w:style w:type="table" w:default="1" w:styleId="TableNormal">

</xml_diff>